<commit_message>
docs(paper): embed fig1 and fig2 png images in docx compilation
</commit_message>
<xml_diff>
--- a/docs/thesis/paper/paper_draft.docx
+++ b/docs/thesis/paper/paper_draft.docx
@@ -2,7 +2,7 @@
 <file path=word/document.xml><?xml version="1.0" encoding="utf-8"?>
 <w:document xmlns:w="http://schemas.openxmlformats.org/wordprocessingml/2006/main" xmlns:m="http://schemas.openxmlformats.org/officeDocument/2006/math" xmlns:r="http://schemas.openxmlformats.org/officeDocument/2006/relationships" xmlns:o="urn:schemas-microsoft-com:office:office" xmlns:v="urn:schemas-microsoft-com:vml" xmlns:w10="urn:schemas-microsoft-com:office:word" xmlns:a="http://schemas.openxmlformats.org/drawingml/2006/main" xmlns:pic="http://schemas.openxmlformats.org/drawingml/2006/picture" xmlns:wp="http://schemas.openxmlformats.org/drawingml/2006/wordprocessingDrawing">
   <w:body>
-    <w:bookmarkStart w:id="39" w:name="Xc327b256cc0ec3078fc4438027defd65f7ecd37"/>
+    <w:bookmarkStart w:id="45" w:name="Xc327b256cc0ec3078fc4438027defd65f7ecd37"/>
     <w:p>
       <w:pPr>
         <w:pStyle w:val="Heading1"/>
@@ -395,7 +395,7 @@
       </w:r>
     </w:p>
     <w:bookmarkEnd w:id="9"/>
-    <w:bookmarkStart w:id="10" w:name="introduction"/>
+    <w:bookmarkStart w:id="13" w:name="introduction"/>
     <w:p>
       <w:pPr>
         <w:pStyle w:val="Heading2"/>
@@ -1067,6 +1067,67 @@
           <w:sz w:val="20"/>
         </w:rPr>
         <w:t xml:space="preserve">), demonstrating that language-level distillation can recover or exceed zero-shot performance without model retraining.</w:t>
+      </w:r>
+    </w:p>
+    <w:p>
+      <w:pPr>
+        <w:pStyle w:val="CaptionedFigure"/>
+        <w:jc w:val="center"/>
+      </w:pPr>
+      <w:r>
+        <w:drawing>
+          <wp:inline>
+            <wp:extent cx="4983480" cy="2630169"/>
+            <wp:effectExtent b="0" l="0" r="0" t="0"/>
+            <wp:docPr descr="Figure 1. Overview of the artifact-aware Teacher-Student-Judge optimization loop. The Student model stays frozen; only the external skill document is rewritten from round-level failure feedback." title="" id="11" name="Picture"/>
+            <a:graphic>
+              <a:graphicData uri="http://schemas.openxmlformats.org/drawingml/2006/picture">
+                <pic:pic>
+                  <pic:nvPicPr>
+                    <pic:cNvPr descr="figures/fig1_system_overview.png" id="12" name="Picture"/>
+                    <pic:cNvPicPr>
+                      <a:picLocks noChangeArrowheads="1" noChangeAspect="1"/>
+                    </pic:cNvPicPr>
+                  </pic:nvPicPr>
+                  <pic:blipFill>
+                    <a:blip r:embed="rId10"/>
+                    <a:stretch>
+                      <a:fillRect/>
+                    </a:stretch>
+                  </pic:blipFill>
+                  <pic:spPr bwMode="auto">
+                    <a:xfrm>
+                      <a:off x="0" y="0"/>
+                      <a:ext cx="4983480" cy="2630169"/>
+                    </a:xfrm>
+                    <a:prstGeom prst="rect">
+                      <a:avLst/>
+                    </a:prstGeom>
+                    <a:noFill/>
+                    <a:ln w="9525">
+                      <a:noFill/>
+                      <a:headEnd/>
+                      <a:tailEnd/>
+                    </a:ln>
+                  </pic:spPr>
+                </pic:pic>
+              </a:graphicData>
+            </a:graphic>
+          </wp:inline>
+        </w:drawing>
+      </w:r>
+    </w:p>
+    <w:p>
+      <w:pPr>
+        <w:pStyle w:val="ImageCaption"/>
+        <w:jc w:val="center"/>
+      </w:pPr>
+      <w:r>
+        <w:rPr>
+          <w:rFonts w:ascii="Times New Roman" w:hAnsi="Times New Roman" w:eastAsia="Times New Roman"/>
+          <w:sz w:val="18"/>
+        </w:rPr>
+        <w:t xml:space="preserve">Figure 1. Overview of the artifact-aware Teacher-Student-Judge optimization loop. The Student model stays frozen; only the external skill document is rewritten from round-level failure feedback.</w:t>
       </w:r>
     </w:p>
     <w:p>
@@ -1079,8 +1140,8 @@
         </w:pict>
       </w:r>
     </w:p>
-    <w:bookmarkEnd w:id="10"/>
-    <w:bookmarkStart w:id="13" w:name="background-and-related-work"/>
+    <w:bookmarkEnd w:id="13"/>
+    <w:bookmarkStart w:id="16" w:name="background-and-related-work"/>
     <w:p>
       <w:pPr>
         <w:pStyle w:val="Heading2"/>
@@ -1094,7 +1155,7 @@
         <w:t xml:space="preserve">2. Background and Related Work</w:t>
       </w:r>
     </w:p>
-    <w:bookmarkStart w:id="11" w:name="agent-skills-and-procedural-knowledge"/>
+    <w:bookmarkStart w:id="14" w:name="agent-skills-and-procedural-knowledge"/>
     <w:p>
       <w:pPr>
         <w:pStyle w:val="Heading3"/>
@@ -1380,8 +1441,8 @@
         <w:t xml:space="preserve">This separation of concerns is particularly critical for resource-constrained SLMs. However, if the L2 body is poorly structured, small models fail to execute the underlying tool-use contracts, highlighting the need for model-specific optimization of the skill text.</w:t>
       </w:r>
     </w:p>
-    <w:bookmarkEnd w:id="11"/>
-    <w:bookmarkStart w:id="12" w:name="Xc6c8acf5c3fe0dac2a301018aec8db32585391b"/>
+    <w:bookmarkEnd w:id="14"/>
+    <w:bookmarkStart w:id="15" w:name="Xc6c8acf5c3fe0dac2a301018aec8db32585391b"/>
     <w:p>
       <w:pPr>
         <w:pStyle w:val="Heading3"/>
@@ -2286,9 +2347,9 @@
         </w:pict>
       </w:r>
     </w:p>
-    <w:bookmarkEnd w:id="12"/>
-    <w:bookmarkEnd w:id="13"/>
-    <w:bookmarkStart w:id="20" w:name="methodology"/>
+    <w:bookmarkEnd w:id="15"/>
+    <w:bookmarkEnd w:id="16"/>
+    <w:bookmarkStart w:id="23" w:name="methodology"/>
     <w:p>
       <w:pPr>
         <w:pStyle w:val="Heading2"/>
@@ -2302,7 +2363,7 @@
         <w:t xml:space="preserve">3. Methodology</w:t>
       </w:r>
     </w:p>
-    <w:bookmarkStart w:id="14" w:name="problem-formalization"/>
+    <w:bookmarkStart w:id="17" w:name="problem-formalization"/>
     <w:p>
       <w:pPr>
         <w:pStyle w:val="Heading3"/>
@@ -3366,8 +3427,8 @@
         </w:pict>
       </w:r>
     </w:p>
-    <w:bookmarkEnd w:id="14"/>
-    <w:bookmarkStart w:id="15" w:name="teacher-student-judge-architecture"/>
+    <w:bookmarkEnd w:id="17"/>
+    <w:bookmarkStart w:id="18" w:name="teacher-student-judge-architecture"/>
     <w:p>
       <w:pPr>
         <w:pStyle w:val="Heading3"/>
@@ -3476,11 +3537,18 @@
       </w:r>
       <w:r>
         <w:rPr>
+          <w:rFonts w:ascii="Times New Roman" w:hAnsi="Times New Roman" w:eastAsia="Times New Roman"/>
+          <w:sz w:val="20"/>
+        </w:rPr>
+        <w:br/>
+      </w:r>
+      <w:r>
+        <w:rPr>
           <w:rStyle w:val="VerbatimChar"/>
           <w:rFonts w:ascii="Times New Roman" w:hAnsi="Times New Roman" w:eastAsia="Times New Roman"/>
           <w:sz w:val="20"/>
         </w:rPr>
-        <w:t xml:space="preserve">    </w:t>
+        <w:t xml:space="preserve">    subgraph "Optimization Loop (Round r)"</w:t>
       </w:r>
       <w:r>
         <w:rPr>
@@ -3495,7 +3563,7 @@
           <w:rFonts w:ascii="Times New Roman" w:hAnsi="Times New Roman" w:eastAsia="Times New Roman"/>
           <w:sz w:val="20"/>
         </w:rPr>
-        <w:t xml:space="preserve">    subgraph "Optimization Loop (Round r)"</w:t>
+        <w:t xml:space="preserve">        Judge --&gt;|Rubric Scores| Summarizer["Reflexion-style Summarizer"]</w:t>
       </w:r>
       <w:r>
         <w:rPr>
@@ -3510,7 +3578,7 @@
           <w:rFonts w:ascii="Times New Roman" w:hAnsi="Times New Roman" w:eastAsia="Times New Roman"/>
           <w:sz w:val="20"/>
         </w:rPr>
-        <w:t xml:space="preserve">        Judge --&gt;|Rubric Scores| Summarizer["Reflexion-style Summarizer"]</w:t>
+        <w:t xml:space="preserve">        Summarizer --&gt;|Consolidated Failure Feedback F_r| Teacher["Teacher Agent: Haiku 4.5"]</w:t>
       </w:r>
       <w:r>
         <w:rPr>
@@ -3525,7 +3593,7 @@
           <w:rFonts w:ascii="Times New Roman" w:hAnsi="Times New Roman" w:eastAsia="Times New Roman"/>
           <w:sz w:val="20"/>
         </w:rPr>
-        <w:t xml:space="preserve">        Summarizer --&gt;|Consolidated Failure Feedback F_r| Teacher["Teacher Agent: Haiku 4.5"]</w:t>
+        <w:t xml:space="preserve">        Teacher --&gt;|Candidate Skill M_candidate| Gate1{"Gate 1: Validation"}</w:t>
       </w:r>
       <w:r>
         <w:rPr>
@@ -3536,11 +3604,18 @@
       </w:r>
       <w:r>
         <w:rPr>
+          <w:rFonts w:ascii="Times New Roman" w:hAnsi="Times New Roman" w:eastAsia="Times New Roman"/>
+          <w:sz w:val="20"/>
+        </w:rPr>
+        <w:br/>
+      </w:r>
+      <w:r>
+        <w:rPr>
           <w:rStyle w:val="VerbatimChar"/>
           <w:rFonts w:ascii="Times New Roman" w:hAnsi="Times New Roman" w:eastAsia="Times New Roman"/>
           <w:sz w:val="20"/>
         </w:rPr>
-        <w:t xml:space="preserve">        Teacher --&gt;|Candidate Skill M_candidate| Gate1{"Gate 1: Validation"}</w:t>
+        <w:t xml:space="preserve">        Gate1 --&gt;|Pass| Gate2{"Gate 2: Rollback"}</w:t>
       </w:r>
       <w:r>
         <w:rPr>
@@ -3555,7 +3630,7 @@
           <w:rFonts w:ascii="Times New Roman" w:hAnsi="Times New Roman" w:eastAsia="Times New Roman"/>
           <w:sz w:val="20"/>
         </w:rPr>
-        <w:t xml:space="preserve">        </w:t>
+        <w:t xml:space="preserve">        Gate1 --&gt;|Fail| Rollback1["Reject &amp; Keep M_r"]</w:t>
       </w:r>
       <w:r>
         <w:rPr>
@@ -3566,11 +3641,18 @@
       </w:r>
       <w:r>
         <w:rPr>
+          <w:rFonts w:ascii="Times New Roman" w:hAnsi="Times New Roman" w:eastAsia="Times New Roman"/>
+          <w:sz w:val="20"/>
+        </w:rPr>
+        <w:br/>
+      </w:r>
+      <w:r>
+        <w:rPr>
           <w:rStyle w:val="VerbatimChar"/>
           <w:rFonts w:ascii="Times New Roman" w:hAnsi="Times New Roman" w:eastAsia="Times New Roman"/>
           <w:sz w:val="20"/>
         </w:rPr>
-        <w:t xml:space="preserve">        Gate1 --&gt;|Pass| Gate2{"Gate 2: Rollback"}</w:t>
+        <w:t xml:space="preserve">        Gate2 --&gt;|Score Gain| Commit["Commit M_r+1"]</w:t>
       </w:r>
       <w:r>
         <w:rPr>
@@ -3585,7 +3667,7 @@
           <w:rFonts w:ascii="Times New Roman" w:hAnsi="Times New Roman" w:eastAsia="Times New Roman"/>
           <w:sz w:val="20"/>
         </w:rPr>
-        <w:t xml:space="preserve">        Gate1 --&gt;|Fail| Rollback1["Reject &amp; Keep M_r"]</w:t>
+        <w:t xml:space="preserve">        Gate2 --&gt;|Score Regress| Rollback2["Rollback to M_best"]</w:t>
       </w:r>
       <w:r>
         <w:rPr>
@@ -3600,7 +3682,7 @@
           <w:rFonts w:ascii="Times New Roman" w:hAnsi="Times New Roman" w:eastAsia="Times New Roman"/>
           <w:sz w:val="20"/>
         </w:rPr>
-        <w:t xml:space="preserve">        </w:t>
+        <w:t xml:space="preserve">    end</w:t>
       </w:r>
       <w:r>
         <w:rPr>
@@ -3608,59 +3690,6 @@
           <w:sz w:val="20"/>
         </w:rPr>
         <w:br/>
-      </w:r>
-      <w:r>
-        <w:rPr>
-          <w:rStyle w:val="VerbatimChar"/>
-          <w:rFonts w:ascii="Times New Roman" w:hAnsi="Times New Roman" w:eastAsia="Times New Roman"/>
-          <w:sz w:val="20"/>
-        </w:rPr>
-        <w:t xml:space="preserve">        Gate2 --&gt;|Score Gain| Commit["Commit M_r+1"]</w:t>
-      </w:r>
-      <w:r>
-        <w:rPr>
-          <w:rFonts w:ascii="Times New Roman" w:hAnsi="Times New Roman" w:eastAsia="Times New Roman"/>
-          <w:sz w:val="20"/>
-        </w:rPr>
-        <w:br/>
-      </w:r>
-      <w:r>
-        <w:rPr>
-          <w:rStyle w:val="VerbatimChar"/>
-          <w:rFonts w:ascii="Times New Roman" w:hAnsi="Times New Roman" w:eastAsia="Times New Roman"/>
-          <w:sz w:val="20"/>
-        </w:rPr>
-        <w:t xml:space="preserve">        Gate2 --&gt;|Score Regress| Rollback2["Rollback to M_best"]</w:t>
-      </w:r>
-      <w:r>
-        <w:rPr>
-          <w:rFonts w:ascii="Times New Roman" w:hAnsi="Times New Roman" w:eastAsia="Times New Roman"/>
-          <w:sz w:val="20"/>
-        </w:rPr>
-        <w:br/>
-      </w:r>
-      <w:r>
-        <w:rPr>
-          <w:rStyle w:val="VerbatimChar"/>
-          <w:rFonts w:ascii="Times New Roman" w:hAnsi="Times New Roman" w:eastAsia="Times New Roman"/>
-          <w:sz w:val="20"/>
-        </w:rPr>
-        <w:t xml:space="preserve">    end</w:t>
-      </w:r>
-      <w:r>
-        <w:rPr>
-          <w:rFonts w:ascii="Times New Roman" w:hAnsi="Times New Roman" w:eastAsia="Times New Roman"/>
-          <w:sz w:val="20"/>
-        </w:rPr>
-        <w:br/>
-      </w:r>
-      <w:r>
-        <w:rPr>
-          <w:rStyle w:val="VerbatimChar"/>
-          <w:rFonts w:ascii="Times New Roman" w:hAnsi="Times New Roman" w:eastAsia="Times New Roman"/>
-          <w:sz w:val="20"/>
-        </w:rPr>
-        <w:t xml:space="preserve">    </w:t>
       </w:r>
       <w:r>
         <w:rPr>
@@ -4769,8 +4798,8 @@
         </w:pict>
       </w:r>
     </w:p>
-    <w:bookmarkEnd w:id="15"/>
-    <w:bookmarkStart w:id="18" w:name="safety-gates-and-rollback-mechanisms"/>
+    <w:bookmarkEnd w:id="18"/>
+    <w:bookmarkStart w:id="21" w:name="safety-gates-and-rollback-mechanisms"/>
     <w:p>
       <w:pPr>
         <w:pStyle w:val="Heading3"/>
@@ -4797,7 +4826,7 @@
         <w:t xml:space="preserve">To prevent the Teacher from introducing regressions or deleting critical instructions that were previously effective, we implement two distinct validation barriers.</w:t>
       </w:r>
     </w:p>
-    <w:bookmarkStart w:id="16" w:name="gate-1-candidate-validation"/>
+    <w:bookmarkStart w:id="19" w:name="gate-1-candidate-validation"/>
     <w:p>
       <w:pPr>
         <w:pStyle w:val="Heading4"/>
@@ -5197,8 +5226,8 @@
         <w:t xml:space="preserve">, forcing the Teacher to regenerate the rewrite in the next round with updated feedback.</w:t>
       </w:r>
     </w:p>
-    <w:bookmarkEnd w:id="16"/>
-    <w:bookmarkStart w:id="17" w:name="gate-2-round-rollback"/>
+    <w:bookmarkEnd w:id="19"/>
+    <w:bookmarkStart w:id="20" w:name="gate-2-round-rollback"/>
     <w:p>
       <w:pPr>
         <w:pStyle w:val="Heading4"/>
@@ -5753,9 +5782,9 @@
         </w:pict>
       </w:r>
     </w:p>
-    <w:bookmarkEnd w:id="17"/>
-    <w:bookmarkEnd w:id="18"/>
-    <w:bookmarkStart w:id="19" w:name="algorithm-pseudocode"/>
+    <w:bookmarkEnd w:id="20"/>
+    <w:bookmarkEnd w:id="21"/>
+    <w:bookmarkStart w:id="22" w:name="algorithm-pseudocode"/>
     <w:p>
       <w:pPr>
         <w:pStyle w:val="Heading3"/>
@@ -6578,9 +6607,9 @@
         </w:pict>
       </w:r>
     </w:p>
-    <w:bookmarkEnd w:id="19"/>
-    <w:bookmarkEnd w:id="20"/>
-    <w:bookmarkStart w:id="23" w:name="experimental-setup"/>
+    <w:bookmarkEnd w:id="22"/>
+    <w:bookmarkEnd w:id="23"/>
+    <w:bookmarkStart w:id="26" w:name="experimental-setup"/>
     <w:p>
       <w:pPr>
         <w:pStyle w:val="Heading2"/>
@@ -6594,7 +6623,7 @@
         <w:t xml:space="preserve">4. Experimental Setup</w:t>
       </w:r>
     </w:p>
-    <w:bookmarkStart w:id="21" w:name="target-skills-and-test-cases"/>
+    <w:bookmarkStart w:id="24" w:name="target-skills-and-test-cases"/>
     <w:p>
       <w:pPr>
         <w:pStyle w:val="Heading3"/>
@@ -7667,8 +7696,8 @@
         </w:pict>
       </w:r>
     </w:p>
-    <w:bookmarkEnd w:id="21"/>
-    <w:bookmarkStart w:id="22" w:name="baselines-and-runtime-parameters"/>
+    <w:bookmarkEnd w:id="24"/>
+    <w:bookmarkStart w:id="25" w:name="baselines-and-runtime-parameters"/>
     <w:p>
       <w:pPr>
         <w:pStyle w:val="Heading3"/>
@@ -8005,9 +8034,9 @@
         </w:pict>
       </w:r>
     </w:p>
-    <w:bookmarkEnd w:id="22"/>
-    <w:bookmarkEnd w:id="23"/>
-    <w:bookmarkStart w:id="31" w:name="results-and-evaluation"/>
+    <w:bookmarkEnd w:id="25"/>
+    <w:bookmarkEnd w:id="26"/>
+    <w:bookmarkStart w:id="37" w:name="results-and-evaluation"/>
     <w:p>
       <w:pPr>
         <w:pStyle w:val="Heading2"/>
@@ -8021,7 +8050,7 @@
         <w:t xml:space="preserve">5. Results and Evaluation</w:t>
       </w:r>
     </w:p>
-    <w:bookmarkStart w:id="24" w:name="quantitative-optimization-results"/>
+    <w:bookmarkStart w:id="30" w:name="quantitative-optimization-results"/>
     <w:p>
       <w:pPr>
         <w:pStyle w:val="Heading3"/>
@@ -9575,6 +9604,67 @@
     </w:p>
     <w:p>
       <w:pPr>
+        <w:pStyle w:val="CaptionedFigure"/>
+        <w:jc w:val="center"/>
+      </w:pPr>
+      <w:r>
+        <w:drawing>
+          <wp:inline>
+            <wp:extent cx="4983480" cy="2907030"/>
+            <wp:effectExtent b="0" l="0" r="0" t="0"/>
+            <wp:docPr descr="Figure 2. Comparison of No-Skill, original skill (R1), and optimized skill (R_peak) scores across the three studied skills." title="" id="28" name="Picture"/>
+            <a:graphic>
+              <a:graphicData uri="http://schemas.openxmlformats.org/drawingml/2006/picture">
+                <pic:pic>
+                  <pic:nvPicPr>
+                    <pic:cNvPr descr="figures/fig2_baseline_results.png" id="29" name="Picture"/>
+                    <pic:cNvPicPr>
+                      <a:picLocks noChangeArrowheads="1" noChangeAspect="1"/>
+                    </pic:cNvPicPr>
+                  </pic:nvPicPr>
+                  <pic:blipFill>
+                    <a:blip r:embed="rId27"/>
+                    <a:stretch>
+                      <a:fillRect/>
+                    </a:stretch>
+                  </pic:blipFill>
+                  <pic:spPr bwMode="auto">
+                    <a:xfrm>
+                      <a:off x="0" y="0"/>
+                      <a:ext cx="4983480" cy="2907030"/>
+                    </a:xfrm>
+                    <a:prstGeom prst="rect">
+                      <a:avLst/>
+                    </a:prstGeom>
+                    <a:noFill/>
+                    <a:ln w="9525">
+                      <a:noFill/>
+                      <a:headEnd/>
+                      <a:tailEnd/>
+                    </a:ln>
+                  </pic:spPr>
+                </pic:pic>
+              </a:graphicData>
+            </a:graphic>
+          </wp:inline>
+        </w:drawing>
+      </w:r>
+    </w:p>
+    <w:p>
+      <w:pPr>
+        <w:pStyle w:val="ImageCaption"/>
+        <w:jc w:val="center"/>
+      </w:pPr>
+      <w:r>
+        <w:rPr>
+          <w:rFonts w:ascii="Times New Roman" w:hAnsi="Times New Roman" w:eastAsia="Times New Roman"/>
+          <w:sz w:val="18"/>
+        </w:rPr>
+        <w:t xml:space="preserve">Figure 2. Comparison of No-Skill, original skill (R1), and optimized skill (R_peak) scores across the three studied skills.</w:t>
+      </w:r>
+    </w:p>
+    <w:p>
+      <w:pPr>
         <w:jc w:val="center"/>
       </w:pPr>
       <w:r>
@@ -9583,8 +9673,8 @@
         </w:pict>
       </w:r>
     </w:p>
-    <w:bookmarkEnd w:id="24"/>
-    <w:bookmarkStart w:id="25" w:name="deconstructing-negative-transfer"/>
+    <w:bookmarkEnd w:id="30"/>
+    <w:bookmarkStart w:id="31" w:name="deconstructing-negative-transfer"/>
     <w:p>
       <w:pPr>
         <w:pStyle w:val="Heading3"/>
@@ -9941,8 +10031,8 @@
         </w:pict>
       </w:r>
     </w:p>
-    <w:bookmarkEnd w:id="25"/>
-    <w:bookmarkStart w:id="29" w:name="Xb505bef1f741e7194f1de0f28c88b53e3f6fad3"/>
+    <w:bookmarkEnd w:id="31"/>
+    <w:bookmarkStart w:id="35" w:name="Xb505bef1f741e7194f1de0f28c88b53e3f6fad3"/>
     <w:p>
       <w:pPr>
         <w:pStyle w:val="Heading3"/>
@@ -9969,7 +10059,7 @@
         <w:t xml:space="preserve">The numerical improvements correlate directly with specific, interpretable modifications introduced by the Teacher model. We present three representative diff case studies.</w:t>
       </w:r>
     </w:p>
-    <w:bookmarkStart w:id="26" w:name="Xadd54dcdb6071930f7f94e3203100ef5bfd0a80"/>
+    <w:bookmarkStart w:id="32" w:name="Xadd54dcdb6071930f7f94e3203100ef5bfd0a80"/>
     <w:p>
       <w:pPr>
         <w:pStyle w:val="Heading4"/>
@@ -10142,8 +10232,8 @@
         <w:t xml:space="preserve">+ - **Fallback Protocol**: If the TOC generator throws a structural error, revert to an outline-level mapping strategy and attempt a direct XML insertion.</w:t>
       </w:r>
     </w:p>
-    <w:bookmarkEnd w:id="26"/>
-    <w:bookmarkStart w:id="27" w:name="Xd1fb97d751b62b673104cfad5ecf228ea023f78"/>
+    <w:bookmarkEnd w:id="32"/>
+    <w:bookmarkStart w:id="33" w:name="Xd1fb97d751b62b673104cfad5ecf228ea023f78"/>
     <w:p>
       <w:pPr>
         <w:pStyle w:val="Heading4"/>
@@ -10302,8 +10392,8 @@
         <w:t xml:space="preserve">+ - **Mandatory Verification Step**: You MUST execute `validate_gif()` via the CLI after every file write. Parse the stdout logs; if any warning regarding frame-count or layout size is returned, delete the file and regenerate.</w:t>
       </w:r>
     </w:p>
-    <w:bookmarkEnd w:id="27"/>
-    <w:bookmarkStart w:id="28" w:name="Xbd37963f1b4a68259c0f2adc9f8f9e8e825adc2"/>
+    <w:bookmarkEnd w:id="33"/>
+    <w:bookmarkStart w:id="34" w:name="Xbd37963f1b4a68259c0f2adc9f8f9e8e825adc2"/>
     <w:p>
       <w:pPr>
         <w:pStyle w:val="Heading4"/>
@@ -10458,9 +10548,9 @@
         </w:pict>
       </w:r>
     </w:p>
-    <w:bookmarkEnd w:id="28"/>
-    <w:bookmarkEnd w:id="29"/>
-    <w:bookmarkStart w:id="30" w:name="optimization-convergence-and-overfitting"/>
+    <w:bookmarkEnd w:id="34"/>
+    <w:bookmarkEnd w:id="35"/>
+    <w:bookmarkStart w:id="36" w:name="optimization-convergence-and-overfitting"/>
     <w:p>
       <w:pPr>
         <w:pStyle w:val="Heading3"/>
@@ -10679,9 +10769,9 @@
         </w:pict>
       </w:r>
     </w:p>
-    <w:bookmarkEnd w:id="30"/>
-    <w:bookmarkEnd w:id="31"/>
-    <w:bookmarkStart w:id="35" w:name="discussion"/>
+    <w:bookmarkEnd w:id="36"/>
+    <w:bookmarkEnd w:id="37"/>
+    <w:bookmarkStart w:id="41" w:name="discussion"/>
     <w:p>
       <w:pPr>
         <w:pStyle w:val="Heading2"/>
@@ -10695,7 +10785,7 @@
         <w:t xml:space="preserve">6. Discussion</w:t>
       </w:r>
     </w:p>
-    <w:bookmarkStart w:id="32" w:name="Xbadda9809918ac728acc7bca2ae72dacaecce2b"/>
+    <w:bookmarkStart w:id="38" w:name="Xbadda9809918ac728acc7bca2ae72dacaecce2b"/>
     <w:p>
       <w:pPr>
         <w:pStyle w:val="Heading3"/>
@@ -10954,8 +11044,8 @@
         </w:pict>
       </w:r>
     </w:p>
-    <w:bookmarkEnd w:id="32"/>
-    <w:bookmarkStart w:id="33" w:name="Xc1a2e814ca516173799e2e7a27d31681715f882"/>
+    <w:bookmarkEnd w:id="38"/>
+    <w:bookmarkStart w:id="39" w:name="Xc1a2e814ca516173799e2e7a27d31681715f882"/>
     <w:p>
       <w:pPr>
         <w:pStyle w:val="Heading3"/>
@@ -11145,8 +11235,8 @@
         </w:pict>
       </w:r>
     </w:p>
-    <w:bookmarkEnd w:id="33"/>
-    <w:bookmarkStart w:id="34" w:name="self-preference-and-judge-bias"/>
+    <w:bookmarkEnd w:id="39"/>
+    <w:bookmarkStart w:id="40" w:name="self-preference-and-judge-bias"/>
     <w:p>
       <w:pPr>
         <w:pStyle w:val="Heading3"/>
@@ -11217,9 +11307,9 @@
         </w:pict>
       </w:r>
     </w:p>
-    <w:bookmarkEnd w:id="34"/>
-    <w:bookmarkEnd w:id="35"/>
-    <w:bookmarkStart w:id="36" w:name="threats-to-validity"/>
+    <w:bookmarkEnd w:id="40"/>
+    <w:bookmarkEnd w:id="41"/>
+    <w:bookmarkStart w:id="42" w:name="threats-to-validity"/>
     <w:p>
       <w:pPr>
         <w:pStyle w:val="Heading2"/>
@@ -11474,8 +11564,8 @@
         </w:pict>
       </w:r>
     </w:p>
-    <w:bookmarkEnd w:id="36"/>
-    <w:bookmarkStart w:id="37" w:name="conclusion-and-future-work"/>
+    <w:bookmarkEnd w:id="42"/>
+    <w:bookmarkStart w:id="43" w:name="conclusion-and-future-work"/>
     <w:p>
       <w:pPr>
         <w:pStyle w:val="Heading2"/>
@@ -11580,8 +11670,8 @@
         </w:pict>
       </w:r>
     </w:p>
-    <w:bookmarkEnd w:id="37"/>
-    <w:bookmarkStart w:id="38" w:name="references"/>
+    <w:bookmarkEnd w:id="43"/>
+    <w:bookmarkStart w:id="44" w:name="references"/>
     <w:p>
       <w:pPr>
         <w:pStyle w:val="Heading2"/>
@@ -11955,8 +12045,8 @@
         <w:t xml:space="preserve">. arXiv:2602.12670.</w:t>
       </w:r>
     </w:p>
-    <w:bookmarkEnd w:id="38"/>
-    <w:bookmarkEnd w:id="39"/>
+    <w:bookmarkEnd w:id="44"/>
+    <w:bookmarkEnd w:id="45"/>
     <w:sectPr>
       <w:footerReference w:type="default" r:id="rId9"/>
       <w:footnotePr>

</xml_diff>

<commit_message>
docs(paper): replace raw mermaid and ASCII plots with rendered png figures
</commit_message>
<xml_diff>
--- a/docs/thesis/paper/paper_draft.docx
+++ b/docs/thesis/paper/paper_draft.docx
@@ -2,7 +2,7 @@
 <file path=word/document.xml><?xml version="1.0" encoding="utf-8"?>
 <w:document xmlns:w="http://schemas.openxmlformats.org/wordprocessingml/2006/main" xmlns:m="http://schemas.openxmlformats.org/officeDocument/2006/math" xmlns:r="http://schemas.openxmlformats.org/officeDocument/2006/relationships" xmlns:o="urn:schemas-microsoft-com:office:office" xmlns:v="urn:schemas-microsoft-com:vml" xmlns:w10="urn:schemas-microsoft-com:office:word" xmlns:a="http://schemas.openxmlformats.org/drawingml/2006/main" xmlns:pic="http://schemas.openxmlformats.org/drawingml/2006/picture" xmlns:wp="http://schemas.openxmlformats.org/drawingml/2006/wordprocessingDrawing">
   <w:body>
-    <w:bookmarkStart w:id="45" w:name="Xc327b256cc0ec3078fc4438027defd65f7ecd37"/>
+    <w:bookmarkStart w:id="48" w:name="Xc327b256cc0ec3078fc4438027defd65f7ecd37"/>
     <w:p>
       <w:pPr>
         <w:pStyle w:val="Heading1"/>
@@ -391,11 +391,11 @@
           <w:rFonts w:ascii="Times New Roman" w:hAnsi="Times New Roman" w:eastAsia="Times New Roman"/>
           <w:sz w:val="18"/>
         </w:rPr>
-        <w:t>Figure 2. Comparison of No-Skill, original skill (R1), and optimized skill (R_peak) scores across the three studied skills.</w:t>
+        <w:t>Figure 2. Performance trajectories over optimization rounds for docx and slack-gif-creator. The stars highlight the peak performance rounds.</w:t>
       </w:r>
     </w:p>
     <w:bookmarkEnd w:id="9"/>
-    <w:bookmarkStart w:id="13" w:name="introduction"/>
+    <w:bookmarkStart w:id="10" w:name="introduction"/>
     <w:p>
       <w:pPr>
         <w:pStyle w:val="Heading2"/>
@@ -1067,67 +1067,6 @@
           <w:sz w:val="20"/>
         </w:rPr>
         <w:t xml:space="preserve">), demonstrating that language-level distillation can recover or exceed zero-shot performance without model retraining.</w:t>
-      </w:r>
-    </w:p>
-    <w:p>
-      <w:pPr>
-        <w:pStyle w:val="CaptionedFigure"/>
-        <w:jc w:val="center"/>
-      </w:pPr>
-      <w:r>
-        <w:drawing>
-          <wp:inline>
-            <wp:extent cx="4983480" cy="2630169"/>
-            <wp:effectExtent b="0" l="0" r="0" t="0"/>
-            <wp:docPr descr="Figure 1. Overview of the artifact-aware Teacher-Student-Judge optimization loop. The Student model stays frozen; only the external skill document is rewritten from round-level failure feedback." title="" id="11" name="Picture"/>
-            <a:graphic>
-              <a:graphicData uri="http://schemas.openxmlformats.org/drawingml/2006/picture">
-                <pic:pic>
-                  <pic:nvPicPr>
-                    <pic:cNvPr descr="figures/fig1_system_overview.png" id="12" name="Picture"/>
-                    <pic:cNvPicPr>
-                      <a:picLocks noChangeArrowheads="1" noChangeAspect="1"/>
-                    </pic:cNvPicPr>
-                  </pic:nvPicPr>
-                  <pic:blipFill>
-                    <a:blip r:embed="rId10"/>
-                    <a:stretch>
-                      <a:fillRect/>
-                    </a:stretch>
-                  </pic:blipFill>
-                  <pic:spPr bwMode="auto">
-                    <a:xfrm>
-                      <a:off x="0" y="0"/>
-                      <a:ext cx="4983480" cy="2630169"/>
-                    </a:xfrm>
-                    <a:prstGeom prst="rect">
-                      <a:avLst/>
-                    </a:prstGeom>
-                    <a:noFill/>
-                    <a:ln w="9525">
-                      <a:noFill/>
-                      <a:headEnd/>
-                      <a:tailEnd/>
-                    </a:ln>
-                  </pic:spPr>
-                </pic:pic>
-              </a:graphicData>
-            </a:graphic>
-          </wp:inline>
-        </w:drawing>
-      </w:r>
-    </w:p>
-    <w:p>
-      <w:pPr>
-        <w:pStyle w:val="ImageCaption"/>
-        <w:jc w:val="center"/>
-      </w:pPr>
-      <w:r>
-        <w:rPr>
-          <w:rFonts w:ascii="Times New Roman" w:hAnsi="Times New Roman" w:eastAsia="Times New Roman"/>
-          <w:sz w:val="18"/>
-        </w:rPr>
-        <w:t xml:space="preserve">Figure 1. Overview of the artifact-aware Teacher-Student-Judge optimization loop. The Student model stays frozen; only the external skill document is rewritten from round-level failure feedback.</w:t>
       </w:r>
     </w:p>
     <w:p>
@@ -1140,8 +1079,20 @@
         </w:pict>
       </w:r>
     </w:p>
-    <w:bookmarkEnd w:id="13"/>
-    <w:bookmarkStart w:id="16" w:name="background-and-related-work"/>
+    <w:p>
+      <w:pPr>
+        <w:jc w:val="center"/>
+      </w:pPr>
+      <w:r>
+        <w:rPr>
+          <w:rFonts w:ascii="Times New Roman" w:hAnsi="Times New Roman" w:eastAsia="Times New Roman"/>
+          <w:sz w:val="18"/>
+        </w:rPr>
+        <w:t>Figure 3. Comparison of No-Skill, original skill (R1), and optimized skill (R_peak) scores across the three studied skills.</w:t>
+      </w:r>
+    </w:p>
+    <w:bookmarkEnd w:id="10"/>
+    <w:bookmarkStart w:id="13" w:name="background-and-related-work"/>
     <w:p>
       <w:pPr>
         <w:pStyle w:val="Heading2"/>
@@ -1155,7 +1106,7 @@
         <w:t xml:space="preserve">2. Background and Related Work</w:t>
       </w:r>
     </w:p>
-    <w:bookmarkStart w:id="14" w:name="agent-skills-and-procedural-knowledge"/>
+    <w:bookmarkStart w:id="11" w:name="agent-skills-and-procedural-knowledge"/>
     <w:p>
       <w:pPr>
         <w:pStyle w:val="Heading3"/>
@@ -1441,8 +1392,8 @@
         <w:t xml:space="preserve">This separation of concerns is particularly critical for resource-constrained SLMs. However, if the L2 body is poorly structured, small models fail to execute the underlying tool-use contracts, highlighting the need for model-specific optimization of the skill text.</w:t>
       </w:r>
     </w:p>
-    <w:bookmarkEnd w:id="14"/>
-    <w:bookmarkStart w:id="15" w:name="Xc6c8acf5c3fe0dac2a301018aec8db32585391b"/>
+    <w:bookmarkEnd w:id="11"/>
+    <w:bookmarkStart w:id="12" w:name="Xc6c8acf5c3fe0dac2a301018aec8db32585391b"/>
     <w:p>
       <w:pPr>
         <w:pStyle w:val="Heading3"/>
@@ -2347,8 +2298,8 @@
         </w:pict>
       </w:r>
     </w:p>
-    <w:bookmarkEnd w:id="15"/>
-    <w:bookmarkEnd w:id="16"/>
+    <w:bookmarkEnd w:id="12"/>
+    <w:bookmarkEnd w:id="13"/>
     <w:bookmarkStart w:id="23" w:name="methodology"/>
     <w:p>
       <w:pPr>
@@ -2363,7 +2314,7 @@
         <w:t xml:space="preserve">3. Methodology</w:t>
       </w:r>
     </w:p>
-    <w:bookmarkStart w:id="17" w:name="problem-formalization"/>
+    <w:bookmarkStart w:id="14" w:name="problem-formalization"/>
     <w:p>
       <w:pPr>
         <w:pStyle w:val="Heading3"/>
@@ -3427,7 +3378,7 @@
         </w:pict>
       </w:r>
     </w:p>
-    <w:bookmarkEnd w:id="17"/>
+    <w:bookmarkEnd w:id="14"/>
     <w:bookmarkStart w:id="18" w:name="teacher-student-judge-architecture"/>
     <w:p>
       <w:pPr>
@@ -3452,318 +3403,68 @@
           <w:rFonts w:ascii="Times New Roman" w:hAnsi="Times New Roman" w:eastAsia="Times New Roman"/>
           <w:sz w:val="20"/>
         </w:rPr>
-        <w:t xml:space="preserve">The optimization framework consists of three distinct LLM agents operating in a closed loop:</w:t>
-      </w:r>
-    </w:p>
-    <w:p>
-      <w:pPr>
-        <w:pStyle w:val="SourceCode"/>
-        <w:jc w:val="both"/>
-      </w:pPr>
-      <w:r>
-        <w:rPr>
-          <w:rStyle w:val="VerbatimChar"/>
-          <w:rFonts w:ascii="Times New Roman" w:hAnsi="Times New Roman" w:eastAsia="Times New Roman"/>
-          <w:sz w:val="20"/>
-        </w:rPr>
-        <w:t xml:space="preserve">graph TD</w:t>
-      </w:r>
-      <w:r>
-        <w:rPr>
-          <w:rFonts w:ascii="Times New Roman" w:hAnsi="Times New Roman" w:eastAsia="Times New Roman"/>
-          <w:sz w:val="20"/>
-        </w:rPr>
-        <w:br/>
-      </w:r>
-      <w:r>
-        <w:rPr>
-          <w:rStyle w:val="VerbatimChar"/>
-          <w:rFonts w:ascii="Times New Roman" w:hAnsi="Times New Roman" w:eastAsia="Times New Roman"/>
-          <w:sz w:val="20"/>
-        </w:rPr>
-        <w:t xml:space="preserve">    subgraph "Execution Loop (Batch size B)"</w:t>
-      </w:r>
-      <w:r>
-        <w:rPr>
-          <w:rFonts w:ascii="Times New Roman" w:hAnsi="Times New Roman" w:eastAsia="Times New Roman"/>
-          <w:sz w:val="20"/>
-        </w:rPr>
-        <w:br/>
-      </w:r>
-      <w:r>
-        <w:rPr>
-          <w:rStyle w:val="VerbatimChar"/>
-          <w:rFonts w:ascii="Times New Roman" w:hAnsi="Times New Roman" w:eastAsia="Times New Roman"/>
-          <w:sz w:val="20"/>
-        </w:rPr>
-        <w:t xml:space="preserve">        Student["Student Agent: Gemma-4-26B"] --&gt;|Produces Artifacts &amp; Log| Env["Execution Sandbox"]</w:t>
-      </w:r>
-      <w:r>
-        <w:rPr>
-          <w:rFonts w:ascii="Times New Roman" w:hAnsi="Times New Roman" w:eastAsia="Times New Roman"/>
-          <w:sz w:val="20"/>
-        </w:rPr>
-        <w:br/>
-      </w:r>
-      <w:r>
-        <w:rPr>
-          <w:rStyle w:val="VerbatimChar"/>
-          <w:rFonts w:ascii="Times New Roman" w:hAnsi="Times New Roman" w:eastAsia="Times New Roman"/>
-          <w:sz w:val="20"/>
-        </w:rPr>
-        <w:t xml:space="preserve">        Env --&gt;|Artifacts &amp; Tool Logs| Judge["LLM-as-Judge: Haiku 4.5"]</w:t>
-      </w:r>
-      <w:r>
-        <w:rPr>
-          <w:rFonts w:ascii="Times New Roman" w:hAnsi="Times New Roman" w:eastAsia="Times New Roman"/>
-          <w:sz w:val="20"/>
-        </w:rPr>
-        <w:br/>
-      </w:r>
-      <w:r>
-        <w:rPr>
-          <w:rStyle w:val="VerbatimChar"/>
-          <w:rFonts w:ascii="Times New Roman" w:hAnsi="Times New Roman" w:eastAsia="Times New Roman"/>
-          <w:sz w:val="20"/>
-        </w:rPr>
-        <w:t xml:space="preserve">    end</w:t>
-      </w:r>
-      <w:r>
-        <w:rPr>
-          <w:rFonts w:ascii="Times New Roman" w:hAnsi="Times New Roman" w:eastAsia="Times New Roman"/>
-          <w:sz w:val="20"/>
-        </w:rPr>
-        <w:br/>
-      </w:r>
-      <w:r>
-        <w:rPr>
-          <w:rFonts w:ascii="Times New Roman" w:hAnsi="Times New Roman" w:eastAsia="Times New Roman"/>
-          <w:sz w:val="20"/>
-        </w:rPr>
-        <w:br/>
-      </w:r>
-      <w:r>
-        <w:rPr>
-          <w:rStyle w:val="VerbatimChar"/>
-          <w:rFonts w:ascii="Times New Roman" w:hAnsi="Times New Roman" w:eastAsia="Times New Roman"/>
-          <w:sz w:val="20"/>
-        </w:rPr>
-        <w:t xml:space="preserve">    subgraph "Optimization Loop (Round r)"</w:t>
-      </w:r>
-      <w:r>
-        <w:rPr>
-          <w:rFonts w:ascii="Times New Roman" w:hAnsi="Times New Roman" w:eastAsia="Times New Roman"/>
-          <w:sz w:val="20"/>
-        </w:rPr>
-        <w:br/>
-      </w:r>
-      <w:r>
-        <w:rPr>
-          <w:rStyle w:val="VerbatimChar"/>
-          <w:rFonts w:ascii="Times New Roman" w:hAnsi="Times New Roman" w:eastAsia="Times New Roman"/>
-          <w:sz w:val="20"/>
-        </w:rPr>
-        <w:t xml:space="preserve">        Judge --&gt;|Rubric Scores| Summarizer["Reflexion-style Summarizer"]</w:t>
-      </w:r>
-      <w:r>
-        <w:rPr>
-          <w:rFonts w:ascii="Times New Roman" w:hAnsi="Times New Roman" w:eastAsia="Times New Roman"/>
-          <w:sz w:val="20"/>
-        </w:rPr>
-        <w:br/>
-      </w:r>
-      <w:r>
-        <w:rPr>
-          <w:rStyle w:val="VerbatimChar"/>
-          <w:rFonts w:ascii="Times New Roman" w:hAnsi="Times New Roman" w:eastAsia="Times New Roman"/>
-          <w:sz w:val="20"/>
-        </w:rPr>
-        <w:t xml:space="preserve">        Summarizer --&gt;|Consolidated Failure Feedback F_r| Teacher["Teacher Agent: Haiku 4.5"]</w:t>
-      </w:r>
-      <w:r>
-        <w:rPr>
-          <w:rFonts w:ascii="Times New Roman" w:hAnsi="Times New Roman" w:eastAsia="Times New Roman"/>
-          <w:sz w:val="20"/>
-        </w:rPr>
-        <w:br/>
-      </w:r>
-      <w:r>
-        <w:rPr>
-          <w:rStyle w:val="VerbatimChar"/>
-          <w:rFonts w:ascii="Times New Roman" w:hAnsi="Times New Roman" w:eastAsia="Times New Roman"/>
-          <w:sz w:val="20"/>
-        </w:rPr>
-        <w:t xml:space="preserve">        Teacher --&gt;|Candidate Skill M_candidate| Gate1{"Gate 1: Validation"}</w:t>
-      </w:r>
-      <w:r>
-        <w:rPr>
-          <w:rFonts w:ascii="Times New Roman" w:hAnsi="Times New Roman" w:eastAsia="Times New Roman"/>
-          <w:sz w:val="20"/>
-        </w:rPr>
-        <w:br/>
-      </w:r>
-      <w:r>
-        <w:rPr>
-          <w:rFonts w:ascii="Times New Roman" w:hAnsi="Times New Roman" w:eastAsia="Times New Roman"/>
-          <w:sz w:val="20"/>
-        </w:rPr>
-        <w:br/>
-      </w:r>
-      <w:r>
-        <w:rPr>
-          <w:rStyle w:val="VerbatimChar"/>
-          <w:rFonts w:ascii="Times New Roman" w:hAnsi="Times New Roman" w:eastAsia="Times New Roman"/>
-          <w:sz w:val="20"/>
-        </w:rPr>
-        <w:t xml:space="preserve">        Gate1 --&gt;|Pass| Gate2{"Gate 2: Rollback"}</w:t>
-      </w:r>
-      <w:r>
-        <w:rPr>
-          <w:rFonts w:ascii="Times New Roman" w:hAnsi="Times New Roman" w:eastAsia="Times New Roman"/>
-          <w:sz w:val="20"/>
-        </w:rPr>
-        <w:br/>
-      </w:r>
-      <w:r>
-        <w:rPr>
-          <w:rStyle w:val="VerbatimChar"/>
-          <w:rFonts w:ascii="Times New Roman" w:hAnsi="Times New Roman" w:eastAsia="Times New Roman"/>
-          <w:sz w:val="20"/>
-        </w:rPr>
-        <w:t xml:space="preserve">        Gate1 --&gt;|Fail| Rollback1["Reject &amp; Keep M_r"]</w:t>
-      </w:r>
-      <w:r>
-        <w:rPr>
-          <w:rFonts w:ascii="Times New Roman" w:hAnsi="Times New Roman" w:eastAsia="Times New Roman"/>
-          <w:sz w:val="20"/>
-        </w:rPr>
-        <w:br/>
-      </w:r>
-      <w:r>
-        <w:rPr>
-          <w:rFonts w:ascii="Times New Roman" w:hAnsi="Times New Roman" w:eastAsia="Times New Roman"/>
-          <w:sz w:val="20"/>
-        </w:rPr>
-        <w:br/>
-      </w:r>
-      <w:r>
-        <w:rPr>
-          <w:rStyle w:val="VerbatimChar"/>
-          <w:rFonts w:ascii="Times New Roman" w:hAnsi="Times New Roman" w:eastAsia="Times New Roman"/>
-          <w:sz w:val="20"/>
-        </w:rPr>
-        <w:t xml:space="preserve">        Gate2 --&gt;|Score Gain| Commit["Commit M_r+1"]</w:t>
-      </w:r>
-      <w:r>
-        <w:rPr>
-          <w:rFonts w:ascii="Times New Roman" w:hAnsi="Times New Roman" w:eastAsia="Times New Roman"/>
-          <w:sz w:val="20"/>
-        </w:rPr>
-        <w:br/>
-      </w:r>
-      <w:r>
-        <w:rPr>
-          <w:rStyle w:val="VerbatimChar"/>
-          <w:rFonts w:ascii="Times New Roman" w:hAnsi="Times New Roman" w:eastAsia="Times New Roman"/>
-          <w:sz w:val="20"/>
-        </w:rPr>
-        <w:t xml:space="preserve">        Gate2 --&gt;|Score Regress| Rollback2["Rollback to M_best"]</w:t>
-      </w:r>
-      <w:r>
-        <w:rPr>
-          <w:rFonts w:ascii="Times New Roman" w:hAnsi="Times New Roman" w:eastAsia="Times New Roman"/>
-          <w:sz w:val="20"/>
-        </w:rPr>
-        <w:br/>
-      </w:r>
-      <w:r>
-        <w:rPr>
-          <w:rStyle w:val="VerbatimChar"/>
-          <w:rFonts w:ascii="Times New Roman" w:hAnsi="Times New Roman" w:eastAsia="Times New Roman"/>
-          <w:sz w:val="20"/>
-        </w:rPr>
-        <w:t xml:space="preserve">    end</w:t>
-      </w:r>
-      <w:r>
-        <w:rPr>
-          <w:rFonts w:ascii="Times New Roman" w:hAnsi="Times New Roman" w:eastAsia="Times New Roman"/>
-          <w:sz w:val="20"/>
-        </w:rPr>
-        <w:br/>
-      </w:r>
-      <w:r>
-        <w:rPr>
-          <w:rFonts w:ascii="Times New Roman" w:hAnsi="Times New Roman" w:eastAsia="Times New Roman"/>
-          <w:sz w:val="20"/>
-        </w:rPr>
-        <w:br/>
-      </w:r>
-      <w:r>
-        <w:rPr>
-          <w:rStyle w:val="VerbatimChar"/>
-          <w:rFonts w:ascii="Times New Roman" w:hAnsi="Times New Roman" w:eastAsia="Times New Roman"/>
-          <w:sz w:val="20"/>
-        </w:rPr>
-        <w:t xml:space="preserve">    Commit --&gt;|Updated SKILL.md| Student</w:t>
-      </w:r>
-      <w:r>
-        <w:rPr>
-          <w:rFonts w:ascii="Times New Roman" w:hAnsi="Times New Roman" w:eastAsia="Times New Roman"/>
-          <w:sz w:val="20"/>
-        </w:rPr>
-        <w:br/>
-      </w:r>
-      <w:r>
-        <w:rPr>
-          <w:rStyle w:val="VerbatimChar"/>
-          <w:rFonts w:ascii="Times New Roman" w:hAnsi="Times New Roman" w:eastAsia="Times New Roman"/>
-          <w:sz w:val="20"/>
-        </w:rPr>
-        <w:t xml:space="preserve">    Rollback1 --&gt;|Keep current SKILL.md| Student</w:t>
-      </w:r>
-      <w:r>
-        <w:rPr>
-          <w:rFonts w:ascii="Times New Roman" w:hAnsi="Times New Roman" w:eastAsia="Times New Roman"/>
-          <w:sz w:val="20"/>
-        </w:rPr>
-        <w:br/>
-      </w:r>
-      <w:r>
-        <w:rPr>
-          <w:rStyle w:val="VerbatimChar"/>
-          <w:rFonts w:ascii="Times New Roman" w:hAnsi="Times New Roman" w:eastAsia="Times New Roman"/>
-          <w:sz w:val="20"/>
-        </w:rPr>
-        <w:t xml:space="preserve">    Rollback2 --&gt;|Restore M_best| Student</w:t>
-      </w:r>
-    </w:p>
-    <w:p>
-      <w:pPr>
-        <w:pStyle w:val="FirstParagraph"/>
+        <w:t xml:space="preserve">The optimization framework consists of three distinct LLM agents operating in a closed loop (Figure 1):</w:t>
+      </w:r>
+    </w:p>
+    <w:p>
+      <w:pPr>
+        <w:pStyle w:val="CaptionedFigure"/>
         <w:jc w:val="center"/>
       </w:pPr>
       <w:r>
-        <w:rPr>
-          <w:rFonts w:ascii="Times New Roman" w:hAnsi="Times New Roman" w:eastAsia="Times New Roman"/>
-          <w:b/>
-          <w:bCs/>
+        <w:drawing>
+          <wp:inline>
+            <wp:extent cx="4983480" cy="2630169"/>
+            <wp:effectExtent b="0" l="0" r="0" t="0"/>
+            <wp:docPr descr="Figure 1. Overview of the artifact-aware Teacher-Student-Judge optimization loop. The Student model stays frozen; only the external skill document is rewritten from round-level failure feedback." title="" id="16" name="Picture"/>
+            <a:graphic>
+              <a:graphicData uri="http://schemas.openxmlformats.org/drawingml/2006/picture">
+                <pic:pic>
+                  <pic:nvPicPr>
+                    <pic:cNvPr descr="figures/fig1_system_overview.png" id="17" name="Picture"/>
+                    <pic:cNvPicPr>
+                      <a:picLocks noChangeArrowheads="1" noChangeAspect="1"/>
+                    </pic:cNvPicPr>
+                  </pic:nvPicPr>
+                  <pic:blipFill>
+                    <a:blip r:embed="rId15"/>
+                    <a:stretch>
+                      <a:fillRect/>
+                    </a:stretch>
+                  </pic:blipFill>
+                  <pic:spPr bwMode="auto">
+                    <a:xfrm>
+                      <a:off x="0" y="0"/>
+                      <a:ext cx="4983480" cy="2630169"/>
+                    </a:xfrm>
+                    <a:prstGeom prst="rect">
+                      <a:avLst/>
+                    </a:prstGeom>
+                    <a:noFill/>
+                    <a:ln w="9525">
+                      <a:noFill/>
+                      <a:headEnd/>
+                      <a:tailEnd/>
+                    </a:ln>
+                  </pic:spPr>
+                </pic:pic>
+              </a:graphicData>
+            </a:graphic>
+          </wp:inline>
+        </w:drawing>
+      </w:r>
+    </w:p>
+    <w:p>
+      <w:pPr>
+        <w:pStyle w:val="ImageCaption"/>
+        <w:jc w:val="center"/>
+      </w:pPr>
+      <w:r>
+        <w:rPr>
+          <w:rFonts w:ascii="Times New Roman" w:hAnsi="Times New Roman" w:eastAsia="Times New Roman"/>
           <w:sz w:val="18"/>
         </w:rPr>
-        <w:t xml:space="preserve">Figure 1:</w:t>
-      </w:r>
-      <w:r>
-        <w:rPr>
-          <w:rFonts w:ascii="Times New Roman" w:hAnsi="Times New Roman" w:eastAsia="Times New Roman"/>
-          <w:sz w:val="18"/>
-        </w:rPr>
-        <w:t xml:space="preserve"> </w:t>
-      </w:r>
-      <w:r>
-        <w:rPr>
-          <w:rFonts w:ascii="Times New Roman" w:hAnsi="Times New Roman" w:eastAsia="Times New Roman"/>
-          <w:sz w:val="18"/>
-        </w:rPr>
-        <w:t xml:space="preserve">Detailed system architecture of the Teacher-Student-Judge optimization loop, demonstrating the interaction between the execution sandbox, the rubric-based evaluator, the log summarizer, and the twin safety gates.</w:t>
+        <w:t xml:space="preserve">Figure 1. Overview of the artifact-aware Teacher-Student-Judge optimization loop. The Student model stays frozen; only the external skill document is rewritten from round-level failure feedback.</w:t>
       </w:r>
     </w:p>
     <w:p>
@@ -8036,7 +7737,7 @@
     </w:p>
     <w:bookmarkEnd w:id="25"/>
     <w:bookmarkEnd w:id="26"/>
-    <w:bookmarkStart w:id="37" w:name="results-and-evaluation"/>
+    <w:bookmarkStart w:id="40" w:name="results-and-evaluation"/>
     <w:p>
       <w:pPr>
         <w:pStyle w:val="Heading2"/>
@@ -8050,7 +7751,7 @@
         <w:t xml:space="preserve">5. Results and Evaluation</w:t>
       </w:r>
     </w:p>
-    <w:bookmarkStart w:id="30" w:name="quantitative-optimization-results"/>
+    <w:bookmarkStart w:id="33" w:name="quantitative-optimization-results"/>
     <w:p>
       <w:pPr>
         <w:pStyle w:val="Heading3"/>
@@ -9318,288 +9019,7 @@
           <w:rFonts w:ascii="Times New Roman" w:hAnsi="Times New Roman" w:eastAsia="Times New Roman"/>
           <w:sz w:val="20"/>
         </w:rPr>
-        <w:t xml:space="preserve">The step-by-step scoring trajectories for all rounds are visualized in Figure 2.</w:t>
-      </w:r>
-    </w:p>
-    <w:p>
-      <w:pPr>
-        <w:pStyle w:val="SourceCode"/>
-        <w:jc w:val="both"/>
-      </w:pPr>
-      <w:r>
-        <w:rPr>
-          <w:rStyle w:val="VerbatimChar"/>
-          <w:rFonts w:ascii="Times New Roman" w:hAnsi="Times New Roman" w:eastAsia="Times New Roman"/>
-          <w:sz w:val="20"/>
-        </w:rPr>
-        <w:t xml:space="preserve">Score (0-1)</w:t>
-      </w:r>
-      <w:r>
-        <w:rPr>
-          <w:rFonts w:ascii="Times New Roman" w:hAnsi="Times New Roman" w:eastAsia="Times New Roman"/>
-          <w:sz w:val="20"/>
-        </w:rPr>
-        <w:br/>
-      </w:r>
-      <w:r>
-        <w:rPr>
-          <w:rStyle w:val="VerbatimChar"/>
-          <w:rFonts w:ascii="Times New Roman" w:hAnsi="Times New Roman" w:eastAsia="Times New Roman"/>
-          <w:sz w:val="20"/>
-        </w:rPr>
-        <w:t xml:space="preserve">  1.00 |</w:t>
-      </w:r>
-      <w:r>
-        <w:rPr>
-          <w:rFonts w:ascii="Times New Roman" w:hAnsi="Times New Roman" w:eastAsia="Times New Roman"/>
-          <w:sz w:val="20"/>
-        </w:rPr>
-        <w:br/>
-      </w:r>
-      <w:r>
-        <w:rPr>
-          <w:rStyle w:val="VerbatimChar"/>
-          <w:rFonts w:ascii="Times New Roman" w:hAnsi="Times New Roman" w:eastAsia="Times New Roman"/>
-          <w:sz w:val="20"/>
-        </w:rPr>
-        <w:t xml:space="preserve">  0.95 |                               * [docx Peak: 0.921]</w:t>
-      </w:r>
-      <w:r>
-        <w:rPr>
-          <w:rFonts w:ascii="Times New Roman" w:hAnsi="Times New Roman" w:eastAsia="Times New Roman"/>
-          <w:sz w:val="20"/>
-        </w:rPr>
-        <w:br/>
-      </w:r>
-      <w:r>
-        <w:rPr>
-          <w:rStyle w:val="VerbatimChar"/>
-          <w:rFonts w:ascii="Times New Roman" w:hAnsi="Times New Roman" w:eastAsia="Times New Roman"/>
-          <w:sz w:val="20"/>
-        </w:rPr>
-        <w:t xml:space="preserve">  0.90 |                         *---*       *</w:t>
-      </w:r>
-      <w:r>
-        <w:rPr>
-          <w:rFonts w:ascii="Times New Roman" w:hAnsi="Times New Roman" w:eastAsia="Times New Roman"/>
-          <w:sz w:val="20"/>
-        </w:rPr>
-        <w:br/>
-      </w:r>
-      <w:r>
-        <w:rPr>
-          <w:rStyle w:val="VerbatimChar"/>
-          <w:rFonts w:ascii="Times New Roman" w:hAnsi="Times New Roman" w:eastAsia="Times New Roman"/>
-          <w:sz w:val="20"/>
-        </w:rPr>
-        <w:t xml:space="preserve">  0.85 |             *---*---*               \---* [docx Final: 0.877]</w:t>
-      </w:r>
-      <w:r>
-        <w:rPr>
-          <w:rFonts w:ascii="Times New Roman" w:hAnsi="Times New Roman" w:eastAsia="Times New Roman"/>
-          <w:sz w:val="20"/>
-        </w:rPr>
-        <w:br/>
-      </w:r>
-      <w:r>
-        <w:rPr>
-          <w:rStyle w:val="VerbatimChar"/>
-          <w:rFonts w:ascii="Times New Roman" w:hAnsi="Times New Roman" w:eastAsia="Times New Roman"/>
-          <w:sz w:val="20"/>
-        </w:rPr>
-        <w:t xml:space="preserve">  0.80 |   * [R1: 0.793]                          \</w:t>
-      </w:r>
-      <w:r>
-        <w:rPr>
-          <w:rFonts w:ascii="Times New Roman" w:hAnsi="Times New Roman" w:eastAsia="Times New Roman"/>
-          <w:sz w:val="20"/>
-        </w:rPr>
-        <w:br/>
-      </w:r>
-      <w:r>
-        <w:rPr>
-          <w:rStyle w:val="VerbatimChar"/>
-          <w:rFonts w:ascii="Times New Roman" w:hAnsi="Times New Roman" w:eastAsia="Times New Roman"/>
-          <w:sz w:val="20"/>
-        </w:rPr>
-        <w:t xml:space="preserve">  0.75 |   |                 * [slack Peak: 0.886] \</w:t>
-      </w:r>
-      <w:r>
-        <w:rPr>
-          <w:rFonts w:ascii="Times New Roman" w:hAnsi="Times New Roman" w:eastAsia="Times New Roman"/>
-          <w:sz w:val="20"/>
-        </w:rPr>
-        <w:br/>
-      </w:r>
-      <w:r>
-        <w:rPr>
-          <w:rStyle w:val="VerbatimChar"/>
-          <w:rFonts w:ascii="Times New Roman" w:hAnsi="Times New Roman" w:eastAsia="Times New Roman"/>
-          <w:sz w:val="20"/>
-        </w:rPr>
-        <w:t xml:space="preserve">  0.70 |   *                 |               *---*  * [slack Final: 0.865]</w:t>
-      </w:r>
-      <w:r>
-        <w:rPr>
-          <w:rFonts w:ascii="Times New Roman" w:hAnsi="Times New Roman" w:eastAsia="Times New Roman"/>
-          <w:sz w:val="20"/>
-        </w:rPr>
-        <w:br/>
-      </w:r>
-      <w:r>
-        <w:rPr>
-          <w:rStyle w:val="VerbatimChar"/>
-          <w:rFonts w:ascii="Times New Roman" w:hAnsi="Times New Roman" w:eastAsia="Times New Roman"/>
-          <w:sz w:val="20"/>
-        </w:rPr>
-        <w:t xml:space="preserve">  0.65 |   \                 \       *-------/</w:t>
-      </w:r>
-      <w:r>
-        <w:rPr>
-          <w:rFonts w:ascii="Times New Roman" w:hAnsi="Times New Roman" w:eastAsia="Times New Roman"/>
-          <w:sz w:val="20"/>
-        </w:rPr>
-        <w:br/>
-      </w:r>
-      <w:r>
-        <w:rPr>
-          <w:rStyle w:val="VerbatimChar"/>
-          <w:rFonts w:ascii="Times New Roman" w:hAnsi="Times New Roman" w:eastAsia="Times New Roman"/>
-          <w:sz w:val="20"/>
-        </w:rPr>
-        <w:t xml:space="preserve">  0.60 |    \---*             \-----/</w:t>
-      </w:r>
-      <w:r>
-        <w:rPr>
-          <w:rFonts w:ascii="Times New Roman" w:hAnsi="Times New Roman" w:eastAsia="Times New Roman"/>
-          <w:sz w:val="20"/>
-        </w:rPr>
-        <w:br/>
-      </w:r>
-      <w:r>
-        <w:rPr>
-          <w:rStyle w:val="VerbatimChar"/>
-          <w:rFonts w:ascii="Times New Roman" w:hAnsi="Times New Roman" w:eastAsia="Times New Roman"/>
-          <w:sz w:val="20"/>
-        </w:rPr>
-        <w:t xml:space="preserve">  0.55 |         \---*---*</w:t>
-      </w:r>
-      <w:r>
-        <w:rPr>
-          <w:rFonts w:ascii="Times New Roman" w:hAnsi="Times New Roman" w:eastAsia="Times New Roman"/>
-          <w:sz w:val="20"/>
-        </w:rPr>
-        <w:br/>
-      </w:r>
-      <w:r>
-        <w:rPr>
-          <w:rStyle w:val="VerbatimChar"/>
-          <w:rFonts w:ascii="Times New Roman" w:hAnsi="Times New Roman" w:eastAsia="Times New Roman"/>
-          <w:sz w:val="20"/>
-        </w:rPr>
-        <w:t xml:space="preserve">  0.50 |__________________________________________________</w:t>
-      </w:r>
-      <w:r>
-        <w:rPr>
-          <w:rFonts w:ascii="Times New Roman" w:hAnsi="Times New Roman" w:eastAsia="Times New Roman"/>
-          <w:sz w:val="20"/>
-        </w:rPr>
-        <w:br/>
-      </w:r>
-      <w:r>
-        <w:rPr>
-          <w:rStyle w:val="VerbatimChar"/>
-          <w:rFonts w:ascii="Times New Roman" w:hAnsi="Times New Roman" w:eastAsia="Times New Roman"/>
-          <w:sz w:val="20"/>
-        </w:rPr>
-        <w:t xml:space="preserve">           R1   R2   R3   R4   R5   R6   R7   R8   R9  R10</w:t>
-      </w:r>
-    </w:p>
-    <w:p>
-      <w:pPr>
-        <w:pStyle w:val="FirstParagraph"/>
-        <w:jc w:val="center"/>
-      </w:pPr>
-      <w:r>
-        <w:rPr>
-          <w:rFonts w:ascii="Times New Roman" w:hAnsi="Times New Roman" w:eastAsia="Times New Roman"/>
-          <w:b/>
-          <w:bCs/>
-          <w:sz w:val="18"/>
-        </w:rPr>
-        <w:t xml:space="preserve">Figure 2:</w:t>
-      </w:r>
-      <w:r>
-        <w:rPr>
-          <w:rFonts w:ascii="Times New Roman" w:hAnsi="Times New Roman" w:eastAsia="Times New Roman"/>
-          <w:sz w:val="18"/>
-        </w:rPr>
-        <w:t xml:space="preserve"> </w:t>
-      </w:r>
-      <w:r>
-        <w:rPr>
-          <w:rFonts w:ascii="Times New Roman" w:hAnsi="Times New Roman" w:eastAsia="Times New Roman"/>
-          <w:sz w:val="18"/>
-        </w:rPr>
-        <w:t xml:space="preserve">Performance trajectories over optimization rounds for</w:t>
-      </w:r>
-      <w:r>
-        <w:rPr>
-          <w:rFonts w:ascii="Times New Roman" w:hAnsi="Times New Roman" w:eastAsia="Times New Roman"/>
-          <w:sz w:val="18"/>
-        </w:rPr>
-        <w:t xml:space="preserve"> </w:t>
-      </w:r>
-      <w:r>
-        <w:rPr>
-          <w:rStyle w:val="VerbatimChar"/>
-          <w:rFonts w:ascii="Times New Roman" w:hAnsi="Times New Roman" w:eastAsia="Times New Roman"/>
-          <w:sz w:val="18"/>
-        </w:rPr>
-        <w:t xml:space="preserve">docx</w:t>
-      </w:r>
-      <w:r>
-        <w:rPr>
-          <w:rFonts w:ascii="Times New Roman" w:hAnsi="Times New Roman" w:eastAsia="Times New Roman"/>
-          <w:sz w:val="18"/>
-        </w:rPr>
-        <w:t xml:space="preserve"> </w:t>
-      </w:r>
-      <w:r>
-        <w:rPr>
-          <w:rFonts w:ascii="Times New Roman" w:hAnsi="Times New Roman" w:eastAsia="Times New Roman"/>
-          <w:sz w:val="18"/>
-        </w:rPr>
-        <w:t xml:space="preserve">(solid line) and</w:t>
-      </w:r>
-      <w:r>
-        <w:rPr>
-          <w:rFonts w:ascii="Times New Roman" w:hAnsi="Times New Roman" w:eastAsia="Times New Roman"/>
-          <w:sz w:val="18"/>
-        </w:rPr>
-        <w:t xml:space="preserve"> </w:t>
-      </w:r>
-      <w:r>
-        <w:rPr>
-          <w:rStyle w:val="VerbatimChar"/>
-          <w:rFonts w:ascii="Times New Roman" w:hAnsi="Times New Roman" w:eastAsia="Times New Roman"/>
-          <w:sz w:val="18"/>
-        </w:rPr>
-        <w:t xml:space="preserve">slack-gif-creator</w:t>
-      </w:r>
-      <w:r>
-        <w:rPr>
-          <w:rFonts w:ascii="Times New Roman" w:hAnsi="Times New Roman" w:eastAsia="Times New Roman"/>
-          <w:sz w:val="18"/>
-        </w:rPr>
-        <w:t xml:space="preserve"> </w:t>
-      </w:r>
-      <w:r>
-        <w:rPr>
-          <w:rFonts w:ascii="Times New Roman" w:hAnsi="Times New Roman" w:eastAsia="Times New Roman"/>
-          <w:sz w:val="18"/>
-        </w:rPr>
-        <w:t xml:space="preserve">(dashed line).</w:t>
+        <w:t xml:space="preserve">The step-by-step scoring trajectories for all rounds are visualized in Figure 2, while the comparative bar chart across all baseline conditions is shown in Figure 3.</w:t>
       </w:r>
     </w:p>
     <w:p>
@@ -9610,20 +9030,81 @@
       <w:r>
         <w:drawing>
           <wp:inline>
-            <wp:extent cx="4983480" cy="2907030"/>
+            <wp:extent cx="4983480" cy="2768599"/>
             <wp:effectExtent b="0" l="0" r="0" t="0"/>
-            <wp:docPr descr="Figure 2. Comparison of No-Skill, original skill (R1), and optimized skill (R_peak) scores across the three studied skills." title="" id="28" name="Picture"/>
+            <wp:docPr descr="Figure 2. Performance trajectories over optimization rounds for docx and slack-gif-creator. The stars highlight the peak performance rounds." title="" id="28" name="Picture"/>
             <a:graphic>
               <a:graphicData uri="http://schemas.openxmlformats.org/drawingml/2006/picture">
                 <pic:pic>
                   <pic:nvPicPr>
-                    <pic:cNvPr descr="figures/fig2_baseline_results.png" id="29" name="Picture"/>
+                    <pic:cNvPr descr="figures/fig3_learning_curves.png" id="29" name="Picture"/>
                     <pic:cNvPicPr>
                       <a:picLocks noChangeArrowheads="1" noChangeAspect="1"/>
                     </pic:cNvPicPr>
                   </pic:nvPicPr>
                   <pic:blipFill>
                     <a:blip r:embed="rId27"/>
+                    <a:stretch>
+                      <a:fillRect/>
+                    </a:stretch>
+                  </pic:blipFill>
+                  <pic:spPr bwMode="auto">
+                    <a:xfrm>
+                      <a:off x="0" y="0"/>
+                      <a:ext cx="4983480" cy="2768599"/>
+                    </a:xfrm>
+                    <a:prstGeom prst="rect">
+                      <a:avLst/>
+                    </a:prstGeom>
+                    <a:noFill/>
+                    <a:ln w="9525">
+                      <a:noFill/>
+                      <a:headEnd/>
+                      <a:tailEnd/>
+                    </a:ln>
+                  </pic:spPr>
+                </pic:pic>
+              </a:graphicData>
+            </a:graphic>
+          </wp:inline>
+        </w:drawing>
+      </w:r>
+    </w:p>
+    <w:p>
+      <w:pPr>
+        <w:pStyle w:val="ImageCaption"/>
+        <w:jc w:val="center"/>
+      </w:pPr>
+      <w:r>
+        <w:rPr>
+          <w:rFonts w:ascii="Times New Roman" w:hAnsi="Times New Roman" w:eastAsia="Times New Roman"/>
+          <w:sz w:val="18"/>
+        </w:rPr>
+        <w:t xml:space="preserve">Figure 2. Performance trajectories over optimization rounds for docx and slack-gif-creator. The stars highlight the peak performance rounds.</w:t>
+      </w:r>
+    </w:p>
+    <w:p>
+      <w:pPr>
+        <w:pStyle w:val="CaptionedFigure"/>
+        <w:jc w:val="center"/>
+      </w:pPr>
+      <w:r>
+        <w:drawing>
+          <wp:inline>
+            <wp:extent cx="4983480" cy="2907030"/>
+            <wp:effectExtent b="0" l="0" r="0" t="0"/>
+            <wp:docPr descr="Figure 3. Comparison of No-Skill, original skill (R1), and optimized skill (R_peak) scores across the three studied skills." title="" id="31" name="Picture"/>
+            <a:graphic>
+              <a:graphicData uri="http://schemas.openxmlformats.org/drawingml/2006/picture">
+                <pic:pic>
+                  <pic:nvPicPr>
+                    <pic:cNvPr descr="figures/fig2_baseline_results.png" id="32" name="Picture"/>
+                    <pic:cNvPicPr>
+                      <a:picLocks noChangeArrowheads="1" noChangeAspect="1"/>
+                    </pic:cNvPicPr>
+                  </pic:nvPicPr>
+                  <pic:blipFill>
+                    <a:blip r:embed="rId30"/>
                     <a:stretch>
                       <a:fillRect/>
                     </a:stretch>
@@ -9660,7 +9141,7 @@
           <w:rFonts w:ascii="Times New Roman" w:hAnsi="Times New Roman" w:eastAsia="Times New Roman"/>
           <w:sz w:val="18"/>
         </w:rPr>
-        <w:t xml:space="preserve">Figure 2. Comparison of No-Skill, original skill (R1), and optimized skill (R_peak) scores across the three studied skills.</w:t>
+        <w:t xml:space="preserve">Figure 3. Comparison of No-Skill, original skill (R1), and optimized skill (R_peak) scores across the three studied skills.</w:t>
       </w:r>
     </w:p>
     <w:p>
@@ -9673,8 +9154,8 @@
         </w:pict>
       </w:r>
     </w:p>
-    <w:bookmarkEnd w:id="30"/>
-    <w:bookmarkStart w:id="31" w:name="deconstructing-negative-transfer"/>
+    <w:bookmarkEnd w:id="33"/>
+    <w:bookmarkStart w:id="34" w:name="deconstructing-negative-transfer"/>
     <w:p>
       <w:pPr>
         <w:pStyle w:val="Heading3"/>
@@ -10031,8 +9512,8 @@
         </w:pict>
       </w:r>
     </w:p>
-    <w:bookmarkEnd w:id="31"/>
-    <w:bookmarkStart w:id="35" w:name="Xb505bef1f741e7194f1de0f28c88b53e3f6fad3"/>
+    <w:bookmarkEnd w:id="34"/>
+    <w:bookmarkStart w:id="38" w:name="Xb505bef1f741e7194f1de0f28c88b53e3f6fad3"/>
     <w:p>
       <w:pPr>
         <w:pStyle w:val="Heading3"/>
@@ -10059,7 +9540,7 @@
         <w:t xml:space="preserve">The numerical improvements correlate directly with specific, interpretable modifications introduced by the Teacher model. We present three representative diff case studies.</w:t>
       </w:r>
     </w:p>
-    <w:bookmarkStart w:id="32" w:name="Xadd54dcdb6071930f7f94e3203100ef5bfd0a80"/>
+    <w:bookmarkStart w:id="35" w:name="Xadd54dcdb6071930f7f94e3203100ef5bfd0a80"/>
     <w:p>
       <w:pPr>
         <w:pStyle w:val="Heading4"/>
@@ -10232,8 +9713,8 @@
         <w:t xml:space="preserve">+ - **Fallback Protocol**: If the TOC generator throws a structural error, revert to an outline-level mapping strategy and attempt a direct XML insertion.</w:t>
       </w:r>
     </w:p>
-    <w:bookmarkEnd w:id="32"/>
-    <w:bookmarkStart w:id="33" w:name="Xd1fb97d751b62b673104cfad5ecf228ea023f78"/>
+    <w:bookmarkEnd w:id="35"/>
+    <w:bookmarkStart w:id="36" w:name="Xd1fb97d751b62b673104cfad5ecf228ea023f78"/>
     <w:p>
       <w:pPr>
         <w:pStyle w:val="Heading4"/>
@@ -10392,8 +9873,8 @@
         <w:t xml:space="preserve">+ - **Mandatory Verification Step**: You MUST execute `validate_gif()` via the CLI after every file write. Parse the stdout logs; if any warning regarding frame-count or layout size is returned, delete the file and regenerate.</w:t>
       </w:r>
     </w:p>
-    <w:bookmarkEnd w:id="33"/>
-    <w:bookmarkStart w:id="34" w:name="Xbd37963f1b4a68259c0f2adc9f8f9e8e825adc2"/>
+    <w:bookmarkEnd w:id="36"/>
+    <w:bookmarkStart w:id="37" w:name="Xbd37963f1b4a68259c0f2adc9f8f9e8e825adc2"/>
     <w:p>
       <w:pPr>
         <w:pStyle w:val="Heading4"/>
@@ -10548,9 +10029,9 @@
         </w:pict>
       </w:r>
     </w:p>
-    <w:bookmarkEnd w:id="34"/>
-    <w:bookmarkEnd w:id="35"/>
-    <w:bookmarkStart w:id="36" w:name="optimization-convergence-and-overfitting"/>
+    <w:bookmarkEnd w:id="37"/>
+    <w:bookmarkEnd w:id="38"/>
+    <w:bookmarkStart w:id="39" w:name="optimization-convergence-and-overfitting"/>
     <w:p>
       <w:pPr>
         <w:pStyle w:val="Heading3"/>
@@ -10769,9 +10250,9 @@
         </w:pict>
       </w:r>
     </w:p>
-    <w:bookmarkEnd w:id="36"/>
-    <w:bookmarkEnd w:id="37"/>
-    <w:bookmarkStart w:id="41" w:name="discussion"/>
+    <w:bookmarkEnd w:id="39"/>
+    <w:bookmarkEnd w:id="40"/>
+    <w:bookmarkStart w:id="44" w:name="discussion"/>
     <w:p>
       <w:pPr>
         <w:pStyle w:val="Heading2"/>
@@ -10785,7 +10266,7 @@
         <w:t xml:space="preserve">6. Discussion</w:t>
       </w:r>
     </w:p>
-    <w:bookmarkStart w:id="38" w:name="Xbadda9809918ac728acc7bca2ae72dacaecce2b"/>
+    <w:bookmarkStart w:id="41" w:name="Xbadda9809918ac728acc7bca2ae72dacaecce2b"/>
     <w:p>
       <w:pPr>
         <w:pStyle w:val="Heading3"/>
@@ -11044,8 +10525,8 @@
         </w:pict>
       </w:r>
     </w:p>
-    <w:bookmarkEnd w:id="38"/>
-    <w:bookmarkStart w:id="39" w:name="Xc1a2e814ca516173799e2e7a27d31681715f882"/>
+    <w:bookmarkEnd w:id="41"/>
+    <w:bookmarkStart w:id="42" w:name="Xc1a2e814ca516173799e2e7a27d31681715f882"/>
     <w:p>
       <w:pPr>
         <w:pStyle w:val="Heading3"/>
@@ -11235,8 +10716,8 @@
         </w:pict>
       </w:r>
     </w:p>
-    <w:bookmarkEnd w:id="39"/>
-    <w:bookmarkStart w:id="40" w:name="self-preference-and-judge-bias"/>
+    <w:bookmarkEnd w:id="42"/>
+    <w:bookmarkStart w:id="43" w:name="self-preference-and-judge-bias"/>
     <w:p>
       <w:pPr>
         <w:pStyle w:val="Heading3"/>
@@ -11307,9 +10788,9 @@
         </w:pict>
       </w:r>
     </w:p>
-    <w:bookmarkEnd w:id="40"/>
-    <w:bookmarkEnd w:id="41"/>
-    <w:bookmarkStart w:id="42" w:name="threats-to-validity"/>
+    <w:bookmarkEnd w:id="43"/>
+    <w:bookmarkEnd w:id="44"/>
+    <w:bookmarkStart w:id="45" w:name="threats-to-validity"/>
     <w:p>
       <w:pPr>
         <w:pStyle w:val="Heading2"/>
@@ -11564,8 +11045,8 @@
         </w:pict>
       </w:r>
     </w:p>
-    <w:bookmarkEnd w:id="42"/>
-    <w:bookmarkStart w:id="43" w:name="conclusion-and-future-work"/>
+    <w:bookmarkEnd w:id="45"/>
+    <w:bookmarkStart w:id="46" w:name="conclusion-and-future-work"/>
     <w:p>
       <w:pPr>
         <w:pStyle w:val="Heading2"/>
@@ -11670,8 +11151,8 @@
         </w:pict>
       </w:r>
     </w:p>
-    <w:bookmarkEnd w:id="43"/>
-    <w:bookmarkStart w:id="44" w:name="references"/>
+    <w:bookmarkEnd w:id="46"/>
+    <w:bookmarkStart w:id="47" w:name="references"/>
     <w:p>
       <w:pPr>
         <w:pStyle w:val="Heading2"/>
@@ -12045,8 +11526,8 @@
         <w:t xml:space="preserve">. arXiv:2602.12670.</w:t>
       </w:r>
     </w:p>
-    <w:bookmarkEnd w:id="44"/>
-    <w:bookmarkEnd w:id="45"/>
+    <w:bookmarkEnd w:id="47"/>
+    <w:bookmarkEnd w:id="48"/>
     <w:sectPr>
       <w:footerReference w:type="default" r:id="rId9"/>
       <w:footnotePr>

</xml_diff>

<commit_message>
fix(paper): resolve invisible figures in Word and fix misplaced captions in docx/pdf
</commit_message>
<xml_diff>
--- a/docs/thesis/paper/paper_draft.docx
+++ b/docs/thesis/paper/paper_draft.docx
@@ -117,27 +117,12 @@
       </w:r>
     </w:p>
     <w:p>
-      <w:pPr>
-        <w:jc w:val="center"/>
-      </w:pPr>
       <w:r>
         <w:pict>
           <v:rect style="width:0;height:1.5pt" o:hralign="center" o:hrstd="t" o:hr="t"/>
         </w:pict>
       </w:r>
     </w:p>
-    <w:p>
-      <w:pPr>
-        <w:jc w:val="center"/>
-      </w:pPr>
-      <w:r>
-        <w:rPr>
-          <w:rFonts w:ascii="Times New Roman" w:hAnsi="Times New Roman" w:eastAsia="Times New Roman"/>
-          <w:sz w:val="18"/>
-        </w:rPr>
-        <w:t>Figure 1. Overview of the artifact-aware Teacher-Student-Judge optimization loop. The Student model stays frozen; only the external skill document is rewritten from round-level failure feedback.</w:t>
-      </w:r>
-    </w:p>
     <w:bookmarkStart w:id="9" w:name="abstract"/>
     <w:p>
       <w:pPr>
@@ -373,27 +358,12 @@
       </w:r>
     </w:p>
     <w:p>
-      <w:pPr>
-        <w:jc w:val="center"/>
-      </w:pPr>
       <w:r>
         <w:pict>
           <v:rect style="width:0;height:1.5pt" o:hralign="center" o:hrstd="t" o:hr="t"/>
         </w:pict>
       </w:r>
     </w:p>
-    <w:p>
-      <w:pPr>
-        <w:jc w:val="center"/>
-      </w:pPr>
-      <w:r>
-        <w:rPr>
-          <w:rFonts w:ascii="Times New Roman" w:hAnsi="Times New Roman" w:eastAsia="Times New Roman"/>
-          <w:sz w:val="18"/>
-        </w:rPr>
-        <w:t>Figure 2. Performance trajectories over optimization rounds for docx and slack-gif-creator. The stars highlight the peak performance rounds.</w:t>
-      </w:r>
-    </w:p>
     <w:bookmarkEnd w:id="9"/>
     <w:bookmarkStart w:id="10" w:name="introduction"/>
     <w:p>
@@ -1070,25 +1040,10 @@
       </w:r>
     </w:p>
     <w:p>
-      <w:pPr>
-        <w:jc w:val="center"/>
-      </w:pPr>
       <w:r>
         <w:pict>
           <v:rect style="width:0;height:1.5pt" o:hralign="center" o:hrstd="t" o:hr="t"/>
         </w:pict>
-      </w:r>
-    </w:p>
-    <w:p>
-      <w:pPr>
-        <w:jc w:val="center"/>
-      </w:pPr>
-      <w:r>
-        <w:rPr>
-          <w:rFonts w:ascii="Times New Roman" w:hAnsi="Times New Roman" w:eastAsia="Times New Roman"/>
-          <w:sz w:val="18"/>
-        </w:rPr>
-        <w:t>Figure 3. Comparison of No-Skill, original skill (R1), and optimized skill (R_peak) scores across the three studied skills.</w:t>
       </w:r>
     </w:p>
     <w:bookmarkEnd w:id="10"/>
@@ -2289,9 +2244,6 @@
       </w:r>
     </w:p>
     <w:p>
-      <w:pPr>
-        <w:jc w:val="center"/>
-      </w:pPr>
       <w:r>
         <w:pict>
           <v:rect style="width:0;height:1.5pt" o:hralign="center" o:hrstd="t" o:hr="t"/>
@@ -3369,9 +3321,6 @@
       </w:r>
     </w:p>
     <w:p>
-      <w:pPr>
-        <w:jc w:val="center"/>
-      </w:pPr>
       <w:r>
         <w:pict>
           <v:rect style="width:0;height:1.5pt" o:hralign="center" o:hrstd="t" o:hr="t"/>
@@ -3414,7 +3363,7 @@
       <w:r>
         <w:drawing>
           <wp:inline>
-            <wp:extent cx="4983480" cy="2630169"/>
+            <wp:extent cx="5334000" cy="2815166"/>
             <wp:effectExtent b="0" l="0" r="0" t="0"/>
             <wp:docPr descr="Figure 1. Overview of the artifact-aware Teacher-Student-Judge optimization loop. The Student model stays frozen; only the external skill document is rewritten from round-level failure feedback." title="" id="16" name="Picture"/>
             <a:graphic>
@@ -3435,7 +3384,7 @@
                   <pic:spPr bwMode="auto">
                     <a:xfrm>
                       <a:off x="0" y="0"/>
-                      <a:ext cx="4983480" cy="2630169"/>
+                      <a:ext cx="5334000" cy="2815166"/>
                     </a:xfrm>
                     <a:prstGeom prst="rect">
                       <a:avLst/>
@@ -4490,9 +4439,6 @@
       </w:r>
     </w:p>
     <w:p>
-      <w:pPr>
-        <w:jc w:val="center"/>
-      </w:pPr>
       <w:r>
         <w:pict>
           <v:rect style="width:0;height:1.5pt" o:hralign="center" o:hrstd="t" o:hr="t"/>
@@ -5474,9 +5420,6 @@
       </w:r>
     </w:p>
     <w:p>
-      <w:pPr>
-        <w:jc w:val="center"/>
-      </w:pPr>
       <w:r>
         <w:pict>
           <v:rect style="width:0;height:1.5pt" o:hralign="center" o:hrstd="t" o:hr="t"/>
@@ -6299,9 +6242,6 @@
       </w:r>
     </w:p>
     <w:p>
-      <w:pPr>
-        <w:jc w:val="center"/>
-      </w:pPr>
       <w:r>
         <w:pict>
           <v:rect style="width:0;height:1.5pt" o:hralign="center" o:hrstd="t" o:hr="t"/>
@@ -7388,9 +7328,6 @@
       </w:r>
     </w:p>
     <w:p>
-      <w:pPr>
-        <w:jc w:val="center"/>
-      </w:pPr>
       <w:r>
         <w:pict>
           <v:rect style="width:0;height:1.5pt" o:hralign="center" o:hrstd="t" o:hr="t"/>
@@ -7726,9 +7663,6 @@
       </w:r>
     </w:p>
     <w:p>
-      <w:pPr>
-        <w:jc w:val="center"/>
-      </w:pPr>
       <w:r>
         <w:pict>
           <v:rect style="width:0;height:1.5pt" o:hralign="center" o:hrstd="t" o:hr="t"/>
@@ -9030,7 +8964,7 @@
       <w:r>
         <w:drawing>
           <wp:inline>
-            <wp:extent cx="4983480" cy="2768599"/>
+            <wp:extent cx="5334000" cy="2963333"/>
             <wp:effectExtent b="0" l="0" r="0" t="0"/>
             <wp:docPr descr="Figure 2. Performance trajectories over optimization rounds for docx and slack-gif-creator. The stars highlight the peak performance rounds." title="" id="28" name="Picture"/>
             <a:graphic>
@@ -9051,7 +8985,7 @@
                   <pic:spPr bwMode="auto">
                     <a:xfrm>
                       <a:off x="0" y="0"/>
-                      <a:ext cx="4983480" cy="2768599"/>
+                      <a:ext cx="5334000" cy="2963333"/>
                     </a:xfrm>
                     <a:prstGeom prst="rect">
                       <a:avLst/>
@@ -9091,7 +9025,7 @@
       <w:r>
         <w:drawing>
           <wp:inline>
-            <wp:extent cx="4983480" cy="2907030"/>
+            <wp:extent cx="5334000" cy="3111500"/>
             <wp:effectExtent b="0" l="0" r="0" t="0"/>
             <wp:docPr descr="Figure 3. Comparison of No-Skill, original skill (R1), and optimized skill (R_peak) scores across the three studied skills." title="" id="31" name="Picture"/>
             <a:graphic>
@@ -9112,7 +9046,7 @@
                   <pic:spPr bwMode="auto">
                     <a:xfrm>
                       <a:off x="0" y="0"/>
-                      <a:ext cx="4983480" cy="2907030"/>
+                      <a:ext cx="5334000" cy="3111500"/>
                     </a:xfrm>
                     <a:prstGeom prst="rect">
                       <a:avLst/>
@@ -9145,9 +9079,6 @@
       </w:r>
     </w:p>
     <w:p>
-      <w:pPr>
-        <w:jc w:val="center"/>
-      </w:pPr>
       <w:r>
         <w:pict>
           <v:rect style="width:0;height:1.5pt" o:hralign="center" o:hrstd="t" o:hr="t"/>
@@ -9503,9 +9434,6 @@
       </w:r>
     </w:p>
     <w:p>
-      <w:pPr>
-        <w:jc w:val="center"/>
-      </w:pPr>
       <w:r>
         <w:pict>
           <v:rect style="width:0;height:1.5pt" o:hralign="center" o:hrstd="t" o:hr="t"/>
@@ -10020,9 +9948,6 @@
       </w:r>
     </w:p>
     <w:p>
-      <w:pPr>
-        <w:jc w:val="center"/>
-      </w:pPr>
       <w:r>
         <w:pict>
           <v:rect style="width:0;height:1.5pt" o:hralign="center" o:hrstd="t" o:hr="t"/>
@@ -10241,9 +10166,6 @@
       </w:r>
     </w:p>
     <w:p>
-      <w:pPr>
-        <w:jc w:val="center"/>
-      </w:pPr>
       <w:r>
         <w:pict>
           <v:rect style="width:0;height:1.5pt" o:hralign="center" o:hrstd="t" o:hr="t"/>
@@ -10516,9 +10438,6 @@
       </w:r>
     </w:p>
     <w:p>
-      <w:pPr>
-        <w:jc w:val="center"/>
-      </w:pPr>
       <w:r>
         <w:pict>
           <v:rect style="width:0;height:1.5pt" o:hralign="center" o:hrstd="t" o:hr="t"/>
@@ -10707,9 +10626,6 @@
       </w:r>
     </w:p>
     <w:p>
-      <w:pPr>
-        <w:jc w:val="center"/>
-      </w:pPr>
       <w:r>
         <w:pict>
           <v:rect style="width:0;height:1.5pt" o:hralign="center" o:hrstd="t" o:hr="t"/>
@@ -10779,9 +10695,6 @@
       </w:r>
     </w:p>
     <w:p>
-      <w:pPr>
-        <w:jc w:val="center"/>
-      </w:pPr>
       <w:r>
         <w:pict>
           <v:rect style="width:0;height:1.5pt" o:hralign="center" o:hrstd="t" o:hr="t"/>
@@ -11036,9 +10949,6 @@
       </w:r>
     </w:p>
     <w:p>
-      <w:pPr>
-        <w:jc w:val="center"/>
-      </w:pPr>
       <w:r>
         <w:pict>
           <v:rect style="width:0;height:1.5pt" o:hralign="center" o:hrstd="t" o:hr="t"/>
@@ -11142,9 +11052,6 @@
       </w:r>
     </w:p>
     <w:p>
-      <w:pPr>
-        <w:jc w:val="center"/>
-      </w:pPr>
       <w:r>
         <w:pict>
           <v:rect style="width:0;height:1.5pt" o:hralign="center" o:hrstd="t" o:hr="t"/>

</xml_diff>